<commit_message>
Reword the dairy and brewery case studies as model documentation
The six case studies no longer address students ("you design", "check
your own", "handout", rs/qt headings): they gain their authors and
affiliation and a scope paragraph that ties each to its database model
and sources. The data workbooks lose their two course sentences, and the
Lua headers name the workbooks as they are in Documents.

Co-Authored-By: Claude Opus 5.5 <noreply@anthropic.com>
</commit_message>
<xml_diff>
--- a/3-IndustrialProcesses/FoodAndBeverage/Brewery/Documents/BreweryBiog_V1_Case_Study_rs_qt.docx
+++ b/3-IndustrialProcesses/FoodAndBeverage/Brewery/Documents/BreweryBiog_V1_Case_Study_rs_qt.docx
@@ -20,6 +20,34 @@
     </w:p>
     <w:p>
       <w:pPr>
+        <w:spacing w:after="100"/>
+      </w:pPr>
+      <w:r>
+        <w:rPr>
+          <w:rFonts w:ascii="Arial" w:cs="Arial" w:eastAsia="Arial" w:hAnsi="Arial"/>
+          <w:color w:val="404040"/>
+          <w:sz w:val="24"/>
+          <w:szCs w:val="24"/>
+        </w:rPr>
+        <w:t xml:space="preserve">Process data for mass and heat integration, compiled from process models and the literature</w:t>
+      </w:r>
+    </w:p>
+    <w:p>
+      <w:pPr>
+        <w:spacing w:after="20"/>
+      </w:pPr>
+      <w:r>
+        <w:rPr>
+          <w:rFonts w:ascii="Arial" w:cs="Arial" w:eastAsia="Arial" w:hAnsi="Arial"/>
+          <w:color w:val="1F3864"/>
+          <w:sz w:val="20"/>
+          <w:szCs w:val="20"/>
+        </w:rPr>
+        <w:t xml:space="preserve">Pullah Bhatnagar, Daniel Flórez-Orrego, Oktay Boztas, Meire Ribeiro Domingos, François Maréchal</w:t>
+      </w:r>
+    </w:p>
+    <w:p>
+      <w:pPr>
         <w:pBdr>
           <w:bottom w:val="single" w:color="1F3864" w:sz="6" w:space="4"/>
         </w:pBdr>
@@ -28,11 +56,26 @@
       <w:r>
         <w:rPr>
           <w:rFonts w:ascii="Arial" w:cs="Arial" w:eastAsia="Arial" w:hAnsi="Arial"/>
-          <w:color w:val="404040"/>
-          <w:sz w:val="24"/>
-          <w:szCs w:val="24"/>
+          <w:i/>
+          <w:iCs/>
+          <w:color w:val="595959"/>
+          <w:sz w:val="18"/>
+          <w:szCs w:val="18"/>
         </w:rPr>
-        <w:t xml:space="preserve">Process data for mass and heat integration: rs and qt tables</w:t>
+        <w:t xml:space="preserve">Industrial Process and Energy Systems Engineering (IPESE) group, EPFL, Sion, Switzerland</w:t>
+      </w:r>
+    </w:p>
+    <w:p>
+      <w:pPr>
+        <w:spacing w:after="120" w:before="0" w:line="264"/>
+      </w:pPr>
+      <w:r>
+        <w:rPr>
+          <w:rFonts w:ascii="Arial" w:cs="Arial" w:eastAsia="Arial" w:hAnsi="Arial"/>
+          <w:sz w:val="20"/>
+          <w:szCs w:val="20"/>
+        </w:rPr>
+        <w:t xml:space="preserve">This case study describes the process data of the brewery model Brewery_V1 of the IETS Task XXIV database of ex-ante models: the material flows, the process electricity and the 29 thermal streams of a brewery that digests its spent grains into biogas, with the options for the use of the biogas, per tonne of beer. The stream data come from the process integration study of a brewery by Maréchal et al. (2013), and the process electricity from sector benchmarks for breweries (IFC, 2007; Galitsky et al., 2003); the biogas upgrading follows Bauer et al. (2013). Table 6 gives the source of each value.</w:t>
       </w:r>
     </w:p>
     <w:p>
@@ -50,7 +93,7 @@
           <w:sz w:val="26"/>
           <w:szCs w:val="26"/>
         </w:rPr>
-        <w:t xml:space="preserve">1. Process</w:t>
+        <w:t xml:space="preserve">1. Process description</w:t>
       </w:r>
     </w:p>
     <w:p>
@@ -406,7 +449,7 @@
           <w:sz w:val="20"/>
           <w:szCs w:val="20"/>
         </w:rPr>
-        <w:t xml:space="preserve"> steam, hot water, the glycol-water loop, the ammonia refrigeration plant and cooling water are supplied by the utility system you design. Fermentation, maturation and chilling appear as hot streams at the beer temperature.</w:t>
+        <w:t xml:space="preserve"> steam, hot water, the glycol-water loop, the ammonia refrigeration plant and cooling water belong to a utility system outside the model boundary. Fermentation, maturation and chilling appear as hot streams at the beer temperature.</w:t>
       </w:r>
     </w:p>
     <w:p>
@@ -487,7 +530,7 @@
           <w:sz w:val="26"/>
           <w:szCs w:val="26"/>
         </w:rPr>
-        <w:t xml:space="preserve">3. rs: material flows</w:t>
+        <w:t xml:space="preserve">3. Material flows</w:t>
       </w:r>
     </w:p>
     <w:p>
@@ -3267,7 +3310,7 @@
           <w:sz w:val="26"/>
           <w:szCs w:val="26"/>
         </w:rPr>
-        <w:t xml:space="preserve">4. rs: process electricity</w:t>
+        <w:t xml:space="preserve">4. Process electricity</w:t>
       </w:r>
     </w:p>
     <w:p>
@@ -4372,7 +4415,7 @@
           <w:sz w:val="16"/>
           <w:szCs w:val="16"/>
         </w:rPr>
-        <w:t xml:space="preserve">Derivation: large breweries use 7.5 to 11.5 kWh of electricity per hectolitre of beer (IFC, 2007, from EC, 2006); the midpoint, 9.5 kWh/hl, with an assumed beer density of 1.01 kg/L, gives 94.1 kWh per tonne of beer. It is split with the midpoints of the shares reported by Galitsky et al. (2003, Table 4), normalised to 100 % because the midpoints add up to 108.5 %. The benchmark, the density and the use of midpoints are assumptions of this handout; the shares come from a survey of UK breweries.</w:t>
+        <w:t xml:space="preserve">Derivation: large breweries use 7.5 to 11.5 kWh of electricity per hectolitre of beer (IFC, 2007, from EC, 2006); the midpoint, 9.5 kWh/hl, with an assumed beer density of 1.01 kg/L, gives 94.1 kWh per tonne of beer. It is split with the midpoints of the shares reported by Galitsky et al. (2003, Table 4), normalised to 100 % because the midpoints add up to 108.5 %. The benchmark, the density and the use of midpoints are assumptions of this case study; the shares come from a survey of UK breweries.</w:t>
       </w:r>
     </w:p>
     <w:p>
@@ -4390,7 +4433,7 @@
           <w:sz w:val="26"/>
           <w:szCs w:val="26"/>
         </w:rPr>
-        <w:t xml:space="preserve">5. qt: thermal streams</w:t>
+        <w:t xml:space="preserve">5. Thermal streams</w:t>
       </w:r>
     </w:p>
     <w:p>
@@ -13160,7 +13203,7 @@
           <w:sz w:val="20"/>
           <w:szCs w:val="20"/>
         </w:rPr>
-        <w:t xml:space="preserve">The biogas leaves the digester as a resource stream. You may either burn it in a cogeneration engine or upgrade it to biomethane with membranes and export it to the gas grid. Both are utility options: compare them with the other utilities you consider.</w:t>
+        <w:t xml:space="preserve">The biogas leaves the digester as a material stream. It can either be burnt in a cogeneration engine or upgraded to biomethane with membranes and exported to the gas grid. Both are utility options, to be compared with the other utilities of the site.</w:t>
       </w:r>
     </w:p>
     <w:p>
@@ -13957,7 +14000,7 @@
           <w:sz w:val="26"/>
           <w:szCs w:val="26"/>
         </w:rPr>
-        <w:t xml:space="preserve">7. Reference targets</w:t>
+        <w:t xml:space="preserve">7. Energy targets</w:t>
       </w:r>
     </w:p>
     <w:p>
@@ -13971,7 +14014,7 @@
           <w:sz w:val="20"/>
           <w:szCs w:val="20"/>
         </w:rPr>
-        <w:t xml:space="preserve">Check your own problem-table or composite-curve calculation against these targets for the 29 streams of Table 3.</w:t>
+        <w:t xml:space="preserve">The problem-table analysis of the 29 streams of Table 3, with the ΔTmin/2 contributions given there, gives the minimum energy targets of Table 5.</w:t>
       </w:r>
     </w:p>
     <w:p>
@@ -15878,7 +15921,7 @@
                 <w:sz w:val="17"/>
                 <w:szCs w:val="17"/>
               </w:rPr>
-              <w:t xml:space="preserve">IFC (2007); Galitsky et al. (2003); midpoints and beer density 1.01 kg/L are assumptions of this handout</w:t>
+              <w:t xml:space="preserve">IFC (2007); Galitsky et al. (2003); midpoints and beer density 1.01 kg/L are assumptions of this case study</w:t>
             </w:r>
           </w:p>
         </w:tc>
@@ -16271,7 +16314,7 @@
           <w:sz w:val="26"/>
           <w:szCs w:val="26"/>
         </w:rPr>
-        <w:t xml:space="preserve">Further reading for students</w:t>
+        <w:t xml:space="preserve">Further reading</w:t>
       </w:r>
     </w:p>
     <w:p>
@@ -16284,7 +16327,7 @@
           <w:sz w:val="20"/>
           <w:szCs w:val="20"/>
         </w:rPr>
-        <w:t xml:space="preserve">Studies of utility integration in breweries (cogeneration, heat pumps, refrigeration), useful once you have your targets:</w:t>
+        <w:t xml:space="preserve">Studies of utility integration in breweries (cogeneration, heat pumps, refrigeration):</w:t>
       </w:r>
     </w:p>
     <w:p>

</xml_diff>

<commit_message>
Cite the dairy and brewery models by their authors
The dairy files no longer cite a student data set (its student authors
and repository link): the stream data are credited to the DWSIM dairy
model of Bhatnagar, Flórez-Orrego, Boztas and Dardor and to the ROSMOSE
paper of Dardor, Flórez-Orrego et al. (2024), cited separately. The
brewery model is cited as the manuscript of Bhatnagar, Flórez-Orrego et
al., its DWSIM model credited to Bhatnagar, Flórez-Orrego and Boztas,
without the link to the student repository; the manuscript moves into
the references of the brewery case studies. Applied to the case studies,
data workbooks, course files, dairy Lua headers, JSON and pages.

Co-Authored-By: Claude Opus 5.5 <noreply@anthropic.com>
</commit_message>
<xml_diff>
--- a/3-IndustrialProcesses/FoodAndBeverage/Brewery/Documents/BreweryBiog_V1_Case_Study_rs_qt.docx
+++ b/3-IndustrialProcesses/FoodAndBeverage/Brewery/Documents/BreweryBiog_V1_Case_Study_rs_qt.docx
@@ -75,7 +75,7 @@
           <w:sz w:val="20"/>
           <w:szCs w:val="20"/>
         </w:rPr>
-        <w:t xml:space="preserve">This case study describes the process data of the brewery model Brewery_V1 of the IETS Task XXIV database of ex-ante models: the material flows, the process electricity and the 29 thermal streams of a brewery that digests its spent grains into biogas, with the options for the use of the biogas, per tonne of beer. The stream data come from the process integration study of a brewery by Maréchal et al. (2013), and the process electricity from sector benchmarks for breweries (IFC, 2007; Galitsky et al., 2003); the biogas upgrading follows Bauer et al. (2013). Table 6 gives the source of each value.</w:t>
+        <w:t xml:space="preserve">This case study describes the process data of the brewery model Brewery_V1 of the IETS Task XXIV database of ex-ante models: the material flows, the process electricity and the 29 thermal streams of a brewery that digests its spent grains into biogas, with the options for the use of the biogas, per tonne of beer. The stream data come from the process integration study of a brewery by Maréchal et al. (2013), the same plant as the brewery model simulated in DWSIM by Bhatnagar, Flórez-Orrego and Boztas (Bhatnagar et al., manuscript), and the process electricity from sector benchmarks for breweries (IFC, 2007; Galitsky et al., 2003); the biogas upgrading follows Bauer et al. (2013). Table 6 gives the source of each value.</w:t>
       </w:r>
     </w:p>
     <w:p>
@@ -15353,7 +15353,7 @@
                 <w:sz w:val="17"/>
                 <w:szCs w:val="17"/>
               </w:rPr>
-              <w:t xml:space="preserve">Maréchal et al. (2013), Table 27.5 and Figs 27.3 to 27.7; same plant as the IPESE DWSIM/ROSMOSE brewery model (Bhatnagar et al.)</w:t>
+              <w:t xml:space="preserve">Maréchal et al. (2013), Table 27.5 and Figs 27.3 to 27.7; same plant as the brewery model simulated in DWSIM by Bhatnagar, Flórez-Orrego and Boztas (Bhatnagar et al., manuscript)</w:t>
             </w:r>
           </w:p>
         </w:tc>
@@ -15495,7 +15495,7 @@
                 <w:sz w:val="17"/>
                 <w:szCs w:val="17"/>
               </w:rPr>
-              <w:t xml:space="preserve">IPESE ROSMOSE brewery model (the source uses 8,180 h/y)</w:t>
+              <w:t xml:space="preserve">Brewery model of Bhatnagar et al. (manuscript); the source uses 8,180 h/y</w:t>
             </w:r>
           </w:p>
         </w:tc>
@@ -16165,6 +16165,42 @@
           <w:szCs w:val="17"/>
         </w:rPr>
         <w:t xml:space="preserve">http://www.sgc.se/ckfinder/userfiles/files/SGC270.pdf</w:t>
+      </w:r>
+    </w:p>
+    <w:p>
+      <w:pPr>
+        <w:pStyle w:val="ListParagraph"/>
+        <w:numPr>
+          <w:ilvl w:val="0"/>
+          <w:numId w:val="4"/>
+        </w:numPr>
+        <w:spacing w:after="60"/>
+      </w:pPr>
+      <w:r>
+        <w:rPr>
+          <w:rFonts w:ascii="Arial" w:cs="Arial" w:eastAsia="Arial" w:hAnsi="Arial"/>
+          <w:sz w:val="17"/>
+          <w:szCs w:val="17"/>
+        </w:rPr>
+        <w:t xml:space="preserve">Bhatnagar P., Flórez-Orrego D., Boztas O., Ribeiro Domingos M., Margni M., Maréchal F. </w:t>
+      </w:r>
+      <w:r>
+        <w:rPr>
+          <w:rFonts w:ascii="Arial" w:cs="Arial" w:eastAsia="Arial" w:hAnsi="Arial"/>
+          <w:i/>
+          <w:iCs/>
+          <w:sz w:val="17"/>
+          <w:szCs w:val="17"/>
+        </w:rPr>
+        <w:t xml:space="preserve">Decarbonizing breweries and distilleries through integrated process and energy system optimization</w:t>
+      </w:r>
+      <w:r>
+        <w:rPr>
+          <w:rFonts w:ascii="Arial" w:cs="Arial" w:eastAsia="Arial" w:hAnsi="Arial"/>
+          <w:sz w:val="17"/>
+          <w:szCs w:val="17"/>
+        </w:rPr>
+        <w:t xml:space="preserve">. Manuscript, EPFL IPESE.</w:t>
       </w:r>
     </w:p>
     <w:p>
@@ -16328,50 +16364,6 @@
           <w:szCs w:val="20"/>
         </w:rPr>
         <w:t xml:space="preserve">Studies of utility integration in breweries (cogeneration, heat pumps, refrigeration):</w:t>
-      </w:r>
-    </w:p>
-    <w:p>
-      <w:pPr>
-        <w:pStyle w:val="ListParagraph"/>
-        <w:numPr>
-          <w:ilvl w:val="0"/>
-          <w:numId w:val="3"/>
-        </w:numPr>
-        <w:spacing w:after="60"/>
-      </w:pPr>
-      <w:r>
-        <w:rPr>
-          <w:rFonts w:ascii="Arial" w:cs="Arial" w:eastAsia="Arial" w:hAnsi="Arial"/>
-          <w:sz w:val="17"/>
-          <w:szCs w:val="17"/>
-        </w:rPr>
-        <w:t xml:space="preserve">Bhatnagar P., Flórez-Orrego D., Boztas O., Ribeiro Domingos M., Margni M., Maréchal F. </w:t>
-      </w:r>
-      <w:r>
-        <w:rPr>
-          <w:rFonts w:ascii="Arial" w:cs="Arial" w:eastAsia="Arial" w:hAnsi="Arial"/>
-          <w:i/>
-          <w:iCs/>
-          <w:sz w:val="17"/>
-          <w:szCs w:val="17"/>
-        </w:rPr>
-        <w:t xml:space="preserve">Decarbonizing breweries and distilleries through integrated process and energy system optimization</w:t>
-      </w:r>
-      <w:r>
-        <w:rPr>
-          <w:rFonts w:ascii="Arial" w:cs="Arial" w:eastAsia="Arial" w:hAnsi="Arial"/>
-          <w:sz w:val="17"/>
-          <w:szCs w:val="17"/>
-        </w:rPr>
-        <w:t xml:space="preserve">. Manuscript, EPFL IPESE. Brewery model: </w:t>
-      </w:r>
-      <w:r>
-        <w:rPr>
-          <w:rFonts w:ascii="Arial" w:cs="Arial" w:eastAsia="Arial" w:hAnsi="Arial"/>
-          <w:sz w:val="17"/>
-          <w:szCs w:val="17"/>
-        </w:rPr>
-        <w:t xml:space="preserve">https://gitlab.epfl.ch/ipese/pinchsmall/brewerycasestudy</w:t>
       </w:r>
     </w:p>
     <w:p>

</xml_diff>